<commit_message>
Fix remaining stale single-deduction Auto-Pay wording in BRD/FRD
Full-repo consistency audit found two more spots still describing the old
consolidated single-deduction Auto-Pay model, which contradicts the locked
per-provider/no-float decision (2026-09-17) already correctly reflected in
BR-04, FR-04, and README:
- BRD Section 4.1 "In Scope" bullet
- FRD Section 3.4 "Flow: Enabling Auto-Pay" steps 2-3

Both rewritten to match BR-04/FR-04. Everything else audited (SQL, Excel,
Power BI data, UAT, README, cross-file references after the
Reference_Materials move) came back consistent with the locked business
model.
</commit_message>
<xml_diff>
--- a/02_FRD/BNPL_Command_Center_FRD.docx
+++ b/02_FRD/BNPL_Command_Center_FRD.docx
@@ -1300,7 +1300,7 @@
         <w:spacing w:after="90" w:line="264" w:lineRule="auto"/>
       </w:pPr>
       <w:r>
-        <w:t>Customer authorizes a single recurring deduction from their linked account.</w:t>
+        <w:t>Customer authorizes the system to deduct payments from their linked account on a per-provider basis — no single consolidated deduction is authorized.</w:t>
       </w:r>
     </w:p>
     <w:p>
@@ -1313,7 +1313,7 @@
         <w:spacing w:after="90" w:line="264" w:lineRule="auto"/>
       </w:pPr>
       <w:r>
-        <w:t>On each due date, the system deducts the total amount once and distributes payment to each BNPL provider on the customer's behalf.</w:t>
+        <w:t>On each provider's own due date, the system deducts that provider's payment amount and pays that provider directly; if multiple providers happen to share a due date, this results in separate same-day deductions, not one combined transfer.</w:t>
       </w:r>
     </w:p>
     <w:p>

</xml_diff>